<commit_message>
final pass before hand-in
</commit_message>
<xml_diff>
--- a/assets/scripts/competence&piv.v2.docx
+++ b/assets/scripts/competence&piv.v2.docx
@@ -96,8 +96,18 @@
           <w:iCs/>
           <w:lang w:val="en-GB"/>
         </w:rPr>
-        <w:t>Hart van Woensel</w:t>
-      </w:r>
+        <w:t xml:space="preserve">Hart van </w:t>
+      </w:r>
+      <w:proofErr w:type="spellStart"/>
+      <w:r>
+        <w:rPr>
+          <w:i/>
+          <w:iCs/>
+          <w:lang w:val="en-GB"/>
+        </w:rPr>
+        <w:t>Woensel</w:t>
+      </w:r>
+      <w:proofErr w:type="spellEnd"/>
       <w:r>
         <w:rPr>
           <w:lang w:val="en-GB"/>
@@ -326,15 +336,9 @@
     <w:p>
       <w:pPr>
         <w:jc w:val="both"/>
-        <w:rPr>
-          <w:lang w:val="en-GB"/>
-        </w:rPr>
-      </w:pPr>
-      <w:r>
-        <w:rPr>
-          <w:lang w:val="en-GB"/>
-        </w:rPr>
-        <w:t>Next to that, I was always interested in science. Physics, math and chemistry felt engaging, while biology and later human physiology were especially intriguing. The way the human body operates still fascinates me. That interest also connected to my roughly three years of working in elderly care, where I saw how much badly designed products and systems can affect people’s independence and frustration in everyday life. Products or systems that seem simple to one person can become difficult when they do not fit someone’s physical ability, routine or experience with technology.</w:t>
+      </w:pPr>
+      <w:r>
+        <w:t>Next to that, I was always interested in science. Physics, math and chemistry felt engaging, while biology, training principles and human physiology became especially interesting to me. The way the body moves, adapts, strengthens and recovers still fascinates me. That interest also connected to my roughly three years of working in elderly care, where I saw how much badly designed products and systems can affect people’s independence and frustration in everyday life.</w:t>
       </w:r>
     </w:p>
     <w:p>
@@ -372,21 +376,21 @@
           <w:u w:val="single"/>
           <w:lang w:val="en-GB"/>
         </w:rPr>
+        <w:t>PRESENT</w:t>
+      </w:r>
+    </w:p>
+    <w:p>
+      <w:pPr>
+        <w:jc w:val="both"/>
+        <w:rPr>
+          <w:lang w:val="en-GB"/>
+        </w:rPr>
+      </w:pPr>
+      <w:r>
+        <w:rPr>
+          <w:lang w:val="en-GB"/>
+        </w:rPr>
         <w:lastRenderedPageBreak/>
-        <w:t>PRESENT</w:t>
-      </w:r>
-    </w:p>
-    <w:p>
-      <w:pPr>
-        <w:jc w:val="both"/>
-        <w:rPr>
-          <w:lang w:val="en-GB"/>
-        </w:rPr>
-      </w:pPr>
-      <w:r>
-        <w:rPr>
-          <w:lang w:val="en-GB"/>
-        </w:rPr>
         <w:t>I am now in the last quartile of my second year. This year was an opportunity to work on areas I did not have the most experience in yet. I started to focus on specific electives and chose roles within projects and courses that allowed me to work on weaknesses. I also chose to describe my development less as five separate expertise areas and more as a set of competences that connect across them. A prototype is not only Technology &amp; Realisation. It can also be a way to test assumptions, communicate a story, create an aesthetic experience or show value to stakeholders. The four competences below describe the clearest parts of my development this year.</w:t>
       </w:r>
     </w:p>
@@ -497,41 +501,51 @@
           <w:iCs/>
           <w:lang w:val="en-GB"/>
         </w:rPr>
-        <w:t>Hart van Woensel</w:t>
-      </w:r>
-      <w:r>
-        <w:rPr>
-          <w:lang w:val="en-GB"/>
-        </w:rPr>
-        <w:t xml:space="preserve"> was the clearest example. Because we worked with Catharina Hospital and the Woensel neighbourhood, the user was not just one person. It included residents, hospital staff, informal caregivers, local organisations and the hospital itself. Through interviews, field observations, stakeholder mapping and client meetings, we learned that the problem was not only medical. Loneliness, limited support at home, low structure and lack of community connection could all influence pressure on care. That changed the project from a more direct intervention into a low-threshold community concept.</w:t>
-      </w:r>
-    </w:p>
-    <w:p>
-      <w:pPr>
-        <w:jc w:val="both"/>
-        <w:rPr>
-          <w:lang w:val="en-GB"/>
-        </w:rPr>
-      </w:pPr>
-      <w:r>
-        <w:rPr>
-          <w:lang w:val="en-GB"/>
-        </w:rPr>
-        <w:t xml:space="preserve">Courses like </w:t>
-      </w:r>
+        <w:t xml:space="preserve">Hart van </w:t>
+      </w:r>
+      <w:proofErr w:type="spellStart"/>
       <w:r>
         <w:rPr>
           <w:i/>
           <w:iCs/>
           <w:lang w:val="en-GB"/>
         </w:rPr>
-        <w:t>Intercultural Design</w:t>
-      </w:r>
-      <w:r>
-        <w:rPr>
-          <w:lang w:val="en-GB"/>
-        </w:rPr>
-        <w:t xml:space="preserve"> and </w:t>
+        <w:t>Woensel</w:t>
+      </w:r>
+      <w:proofErr w:type="spellEnd"/>
+      <w:r>
+        <w:rPr>
+          <w:lang w:val="en-GB"/>
+        </w:rPr>
+        <w:t xml:space="preserve"> was the clearest example. Because we worked with Catharina Hospital and the </w:t>
+      </w:r>
+      <w:proofErr w:type="spellStart"/>
+      <w:r>
+        <w:rPr>
+          <w:lang w:val="en-GB"/>
+        </w:rPr>
+        <w:t>Woensel</w:t>
+      </w:r>
+      <w:proofErr w:type="spellEnd"/>
+      <w:r>
+        <w:rPr>
+          <w:lang w:val="en-GB"/>
+        </w:rPr>
+        <w:t xml:space="preserve"> neighbourhood, the user was not just one person. It included residents, hospital staff, informal caregivers, local organisations and the hospital itself. Through interviews, field observations, stakeholder mapping and client meetings, we learned that the problem was not only medical. Loneliness, limited support at home, low structure and lack of community connection could all influence pressure on care. That changed the project from a more direct intervention into a low-threshold community concept.</w:t>
+      </w:r>
+    </w:p>
+    <w:p>
+      <w:pPr>
+        <w:jc w:val="both"/>
+        <w:rPr>
+          <w:lang w:val="en-GB"/>
+        </w:rPr>
+      </w:pPr>
+      <w:r>
+        <w:rPr>
+          <w:lang w:val="en-GB"/>
+        </w:rPr>
+        <w:t xml:space="preserve">Courses like </w:t>
       </w:r>
       <w:r>
         <w:rPr>
@@ -539,6 +553,20 @@
           <w:iCs/>
           <w:lang w:val="en-GB"/>
         </w:rPr>
+        <w:t>Intercultural Design</w:t>
+      </w:r>
+      <w:r>
+        <w:rPr>
+          <w:lang w:val="en-GB"/>
+        </w:rPr>
+        <w:t xml:space="preserve"> and </w:t>
+      </w:r>
+      <w:r>
+        <w:rPr>
+          <w:i/>
+          <w:iCs/>
+          <w:lang w:val="en-GB"/>
+        </w:rPr>
         <w:t>Sustainability and Design</w:t>
       </w:r>
       <w:r>
@@ -862,7 +890,31 @@
         <w:rPr>
           <w:lang w:val="en-GB"/>
         </w:rPr>
-        <w:t xml:space="preserve"> was another important step. My group used Arduino and several sensors, including humidity sensing and a heart-rate bracelet, to run a small study on how exercise influenced sleep quality. It was limited and quite amateur, but that made it way more approachable. I learned that collecting data from real behaviour is messy. Sensor values do not automatically mean anything; they need a clear research question, careful interpretation and awareness of limitations.</w:t>
+        <w:t xml:space="preserve"> was another important step. My group used Arduino and several sensors, including humidity sensing and a heart-rate bracelet, to run a small study on how exercise influenced sleep quality. It was </w:t>
+      </w:r>
+      <w:r>
+        <w:rPr>
+          <w:lang w:val="en-GB"/>
+        </w:rPr>
+        <w:t xml:space="preserve">of course </w:t>
+      </w:r>
+      <w:r>
+        <w:rPr>
+          <w:lang w:val="en-GB"/>
+        </w:rPr>
+        <w:t xml:space="preserve">limited and quite </w:t>
+      </w:r>
+      <w:r>
+        <w:rPr>
+          <w:lang w:val="en-GB"/>
+        </w:rPr>
+        <w:t>exploratory</w:t>
+      </w:r>
+      <w:r>
+        <w:rPr>
+          <w:lang w:val="en-GB"/>
+        </w:rPr>
+        <w:t>, but that made it way more approachable. I learned that collecting data from real behaviour is messy. Sensor values do not automatically mean anything; they need a clear research question, careful interpretation and awareness of limitations.</w:t>
       </w:r>
     </w:p>
     <w:p>
@@ -1001,129 +1053,125 @@
           <w:iCs/>
           <w:lang w:val="en-GB"/>
         </w:rPr>
-        <w:t>Hart van Woensel</w:t>
-      </w:r>
-      <w:r>
-        <w:rPr>
-          <w:lang w:val="en-GB"/>
-        </w:rPr>
-        <w:t>. Because the concept was a community-centred system rather than one physical product, the presentation had to carry a lot of weight. Our coach and Catharina Hospital pushed us to define a clearer identity for the proposal. The booklet, logo, physical model and presentation material were not just there to make the project look finished. They helped communicate accessibility, trust and community. They also made the value of the concept easier to understand for different stakeholders.</w:t>
-      </w:r>
-    </w:p>
-    <w:p>
-      <w:pPr>
-        <w:jc w:val="both"/>
-        <w:rPr>
-          <w:lang w:val="en-GB"/>
-        </w:rPr>
-      </w:pPr>
-      <w:r>
-        <w:rPr>
-          <w:lang w:val="en-GB"/>
-        </w:rPr>
-        <w:t xml:space="preserve">My feedback on the previous PI&amp;V assignment also made me look at Business &amp; Entrepreneurship more critically. I had connected it too much to client contact and professional presentation. Those are relevant, but too limited. In </w:t>
-      </w:r>
+        <w:t xml:space="preserve">Hart van </w:t>
+      </w:r>
+      <w:proofErr w:type="spellStart"/>
       <w:r>
         <w:rPr>
           <w:i/>
           <w:iCs/>
           <w:lang w:val="en-GB"/>
         </w:rPr>
-        <w:t>Design Innovation Methods</w:t>
-      </w:r>
-      <w:r>
-        <w:rPr>
-          <w:lang w:val="en-GB"/>
-        </w:rPr>
-        <w:t>, we analysed an existing company and created a value proposition based on facts, trends and numbers. That helped me understand that value has to be argued, not just assumed.</w:t>
-      </w:r>
-    </w:p>
-    <w:p>
-      <w:pPr>
-        <w:jc w:val="both"/>
-        <w:rPr>
-          <w:lang w:val="en-GB"/>
-        </w:rPr>
-      </w:pPr>
+        <w:t>Woensel</w:t>
+      </w:r>
+      <w:proofErr w:type="spellEnd"/>
+      <w:r>
+        <w:rPr>
+          <w:lang w:val="en-GB"/>
+        </w:rPr>
+        <w:t>. Because the concept was a community-centred system rather than one physical product, the presentation had to carry a lot of weight. Our coach and Catharina Hospital pushed us to define a clearer identity for the proposal. The booklet, logo, physical model and presentation material were not just there to make the project look finished. They helped communicate accessibility, trust and community. They also made the value of the concept easier to understand for different stakeholders.</w:t>
+      </w:r>
+    </w:p>
+    <w:p>
+      <w:pPr>
+        <w:jc w:val="both"/>
+        <w:rPr>
+          <w:lang w:val="en-GB"/>
+        </w:rPr>
+      </w:pPr>
+      <w:r>
+        <w:rPr>
+          <w:lang w:val="en-GB"/>
+        </w:rPr>
+        <w:t xml:space="preserve">My feedback on the previous PI&amp;V assignment also made me look at Business &amp; Entrepreneurship more critically. I had connected it too much to client contact and professional presentation. Those are relevant, but too limited. In </w:t>
+      </w:r>
       <w:r>
         <w:rPr>
           <w:i/>
           <w:iCs/>
           <w:lang w:val="en-GB"/>
         </w:rPr>
-        <w:t>Sustainability and Design</w:t>
-      </w:r>
-      <w:r>
-        <w:rPr>
-          <w:lang w:val="en-GB"/>
-        </w:rPr>
-        <w:t xml:space="preserve"> added another layer to this. A design proposal can create economic value, but also social and environmental value. That made me more aware that a strong concept should be desirable, responsible and realistic within the system it enters.</w:t>
-      </w:r>
-    </w:p>
-    <w:p>
-      <w:pPr>
-        <w:jc w:val="both"/>
-        <w:rPr>
-          <w:lang w:val="en-GB"/>
-        </w:rPr>
-      </w:pPr>
-      <w:r>
-        <w:rPr>
-          <w:lang w:val="en-GB"/>
-        </w:rPr>
-        <w:t>For me, this competence is about translating a design into something others can understand and believe in. My next step is to become more precise in explaining what kind of value a concept creates, for whom it creates that value, and what would need to be tested before claiming that value too strongly.</w:t>
-      </w:r>
-    </w:p>
-    <w:p>
-      <w:pPr>
-        <w:jc w:val="both"/>
-        <w:rPr>
-          <w:lang w:val="en-GB"/>
-        </w:rPr>
-      </w:pPr>
-    </w:p>
-    <w:p>
-      <w:pPr>
-        <w:jc w:val="both"/>
-        <w:rPr>
-          <w:u w:val="single"/>
-          <w:lang w:val="en-GB"/>
-        </w:rPr>
-      </w:pPr>
-      <w:r>
-        <w:rPr>
-          <w:u w:val="single"/>
-          <w:lang w:val="en-GB"/>
-        </w:rPr>
-        <w:t>FUTURE</w:t>
-      </w:r>
-    </w:p>
-    <w:p>
-      <w:pPr>
-        <w:jc w:val="both"/>
-        <w:rPr>
-          <w:lang w:val="en-GB"/>
-        </w:rPr>
-      </w:pPr>
-      <w:r>
-        <w:rPr>
-          <w:lang w:val="en-GB"/>
-        </w:rPr>
-        <w:t xml:space="preserve">For the rest of this year, my main focus is finishing my current courses properly and using them to keep developing the points I mentioned. </w:t>
-      </w:r>
+        <w:t>Design Innovation Methods</w:t>
+      </w:r>
+      <w:r>
+        <w:rPr>
+          <w:lang w:val="en-GB"/>
+        </w:rPr>
+        <w:t>, we analysed an existing company and created a value proposition based on facts, trends and numbers. That helped me understand that value has to be argued, not just assumed.</w:t>
+      </w:r>
+    </w:p>
+    <w:p>
+      <w:pPr>
+        <w:jc w:val="both"/>
+        <w:rPr>
+          <w:lang w:val="en-GB"/>
+        </w:rPr>
+      </w:pPr>
       <w:r>
         <w:rPr>
           <w:i/>
           <w:iCs/>
           <w:lang w:val="en-GB"/>
         </w:rPr>
-        <w:t>Intercultural Design</w:t>
-      </w:r>
-      <w:r>
-        <w:rPr>
-          <w:lang w:val="en-GB"/>
-        </w:rPr>
-        <w:t xml:space="preserve"> helps me look beyond my own assumptions and understand how culture and context influence design. </w:t>
+        <w:t>Sustainability and Design</w:t>
+      </w:r>
+      <w:r>
+        <w:rPr>
+          <w:lang w:val="en-GB"/>
+        </w:rPr>
+        <w:t xml:space="preserve"> added another layer to this. A design proposal can create economic value, but also social and environmental value. That made me more aware that a strong concept should be desirable, responsible and realistic within the system it enters.</w:t>
+      </w:r>
+    </w:p>
+    <w:p>
+      <w:pPr>
+        <w:jc w:val="both"/>
+        <w:rPr>
+          <w:lang w:val="en-GB"/>
+        </w:rPr>
+      </w:pPr>
+      <w:r>
+        <w:rPr>
+          <w:lang w:val="en-GB"/>
+        </w:rPr>
+        <w:t>For me, this competence is about translating a design into something others can understand and believe in. My next step is to become more precise in explaining what kind of value a concept creates, for whom it creates that value, and what would need to be tested before claiming that value too strongly.</w:t>
+      </w:r>
+    </w:p>
+    <w:p>
+      <w:pPr>
+        <w:jc w:val="both"/>
+        <w:rPr>
+          <w:lang w:val="en-GB"/>
+        </w:rPr>
+      </w:pPr>
+    </w:p>
+    <w:p>
+      <w:pPr>
+        <w:jc w:val="both"/>
+        <w:rPr>
+          <w:u w:val="single"/>
+          <w:lang w:val="en-GB"/>
+        </w:rPr>
+      </w:pPr>
+      <w:r>
+        <w:rPr>
+          <w:u w:val="single"/>
+          <w:lang w:val="en-GB"/>
+        </w:rPr>
+        <w:t>FUTURE</w:t>
+      </w:r>
+    </w:p>
+    <w:p>
+      <w:pPr>
+        <w:jc w:val="both"/>
+        <w:rPr>
+          <w:lang w:val="en-GB"/>
+        </w:rPr>
+      </w:pPr>
+      <w:r>
+        <w:rPr>
+          <w:lang w:val="en-GB"/>
+        </w:rPr>
+        <w:t xml:space="preserve">For the rest of this year, my main focus is finishing my current courses properly and using them to keep developing the points I mentioned. </w:t>
       </w:r>
       <w:r>
         <w:rPr>
@@ -1131,6 +1179,20 @@
           <w:iCs/>
           <w:lang w:val="en-GB"/>
         </w:rPr>
+        <w:t>Intercultural Design</w:t>
+      </w:r>
+      <w:r>
+        <w:rPr>
+          <w:lang w:val="en-GB"/>
+        </w:rPr>
+        <w:t xml:space="preserve"> helps me look beyond my own assumptions and understand how culture and context influence design. </w:t>
+      </w:r>
+      <w:r>
+        <w:rPr>
+          <w:i/>
+          <w:iCs/>
+          <w:lang w:val="en-GB"/>
+        </w:rPr>
         <w:t>Engineering for People</w:t>
       </w:r>
       <w:r>
@@ -1143,29 +1205,32 @@
     <w:p>
       <w:pPr>
         <w:jc w:val="both"/>
-        <w:rPr>
-          <w:lang w:val="en-GB"/>
-        </w:rPr>
-      </w:pPr>
-      <w:r>
-        <w:rPr>
-          <w:lang w:val="en-GB"/>
-        </w:rPr>
-        <w:t>Next year, I am planning to do an internship before starting my BEP. I am mainly looking for a place that combines hands-on product development with interaction, health, movement, accessibility or technical prototyping. That direction fits my identity because I want to keep working close to materials, users and technical systems. It also fits my vision, because I am interested in products and systems that make technology feel more understandable and human.</w:t>
-      </w:r>
-    </w:p>
-    <w:p>
-      <w:pPr>
-        <w:jc w:val="both"/>
-        <w:rPr>
-          <w:lang w:val="en-GB"/>
-        </w:rPr>
-      </w:pPr>
-      <w:r>
-        <w:rPr>
-          <w:lang w:val="en-GB"/>
-        </w:rPr>
+      </w:pPr>
+      <w:r>
+        <w:t xml:space="preserve">Next year, I am planning to do an internship before starting my BEP. I am mainly looking for a place that combines hands-on product development with health, movement, accessibility, interaction or technical prototyping. </w:t>
+      </w:r>
+      <w:r>
+        <w:t>The company S</w:t>
+      </w:r>
+      <w:r>
+        <w:t xml:space="preserve">mart Floor, for example, interests me because it connects physical interaction, movement analysis, data and ageing. That direction fits my identity because I want to work close to materials, users, technical systems and the human body. </w:t>
+      </w:r>
+      <w:r>
         <w:lastRenderedPageBreak/>
+        <w:t>It also fits my vision, because I am interested in products and systems that translate technical or bodily complexity into something understandable and human.</w:t>
+      </w:r>
+    </w:p>
+    <w:p>
+      <w:pPr>
+        <w:jc w:val="both"/>
+        <w:rPr>
+          <w:lang w:val="en-GB"/>
+        </w:rPr>
+      </w:pPr>
+      <w:r>
+        <w:rPr>
+          <w:lang w:val="en-GB"/>
+        </w:rPr>
         <w:t xml:space="preserve">Until now, most of my design work has happened within university projects. An internship would give me a more realistic view of how a design company </w:t>
       </w:r>
       <w:r>

</xml_diff>